<commit_message>
Update proposal v2: 6-pillar grid overview + Pillar 1 detailed IEC activities table
- Add styled 6-pillar overview grid (NAVY/CREAM alternating, large numbered cells)
- Add 10-row Pillar 1 activities table: 27-vehicle follow-ups, ULB knowledge transfer,
  citizen feedback mechanism, Swachhata Champions felicitation, signboards/murals ULB
  approval, two Zero Waste Melas, monthly ward cleanups, dark spot documentation,
  17 dark spot transformations, HR deployment
- Each activity row: LIGHT/TEAL alternating with activity name, scope tag, detail text

https://claude.ai/code/session_01B9yVw1c891BW8aVY482vAg
</commit_message>
<xml_diff>
--- a/proposals/WasteWarriors_CocaCola_Proposal_v2.docx
+++ b/proposals/WasteWarriors_CocaCola_Proposal_v2.docx
@@ -1325,6 +1325,371 @@
         <w:rPr>
           <w:color w:val="1B2A4A"/>
         </w:rPr>
+        <w:t>Proposed Intervention: Six Pillars of the Waste Value Chain</w:t>
+      </w:r>
+    </w:p>
+    <w:p>
+      <w:pPr>
+        <w:spacing w:before="40" w:after="200"/>
+        <w:jc w:val="both"/>
+      </w:pPr>
+      <w:r>
+        <w:rPr>
+          <w:b w:val="0"/>
+          <w:color w:val="333333"/>
+          <w:sz w:val="20"/>
+        </w:rPr>
+        <w:t>This programme builds a complete, end-to-end waste value chain across Dharamshala. Waste Warriors proposes to intervene across six interdependent pillars simultaneously; a failure at any single stage undermines the system as a whole. Coca-Cola's investment funds the full chain, ensuring that every rupee spent on collection is backed by processing capacity, every tonne processed translates into measurable livelihoods, and every behaviour change effort is reinforced by a functioning system on the ground.</w:t>
+      </w:r>
+    </w:p>
+    <w:tbl>
+      <w:tblPr>
+        <w:tblW w:type="auto" w:w="0"/>
+        <w:jc w:val="center"/>
+        <w:tblLook w:firstColumn="1" w:firstRow="1" w:lastColumn="0" w:lastRow="0" w:noHBand="0" w:noVBand="1" w:val="04A0"/>
+      </w:tblPr>
+      <w:tblGrid>
+        <w:gridCol w:w="3120"/>
+        <w:gridCol w:w="3120"/>
+        <w:gridCol w:w="3120"/>
+      </w:tblGrid>
+      <w:tr>
+        <w:tc>
+          <w:tcPr>
+            <w:tcW w:type="dxa" w:w="3118"/>
+            <w:shd w:val="clear" w:color="auto" w:fill="FDF6E3"/>
+            <w:tcBorders>
+              <w:top w:val="single" w:sz="4" w:space="0" w:color="CCCCCC"/>
+              <w:left w:val="single" w:sz="4" w:space="0" w:color="CCCCCC"/>
+              <w:bottom w:val="single" w:sz="4" w:space="0" w:color="CCCCCC"/>
+              <w:right w:val="single" w:sz="4" w:space="0" w:color="CCCCCC"/>
+            </w:tcBorders>
+            <w:tcMar>
+              <w:top w:w="120" w:type="dxa"/>
+              <w:bottom w:w="120" w:type="dxa"/>
+              <w:left w:w="140" w:type="dxa"/>
+              <w:right w:w="140" w:type="dxa"/>
+            </w:tcMar>
+          </w:tcPr>
+          <w:p>
+            <w:r>
+              <w:rPr>
+                <w:b/>
+                <w:color w:val="1B2A4A"/>
+                <w:sz w:val="56"/>
+              </w:rPr>
+              <w:t>01</w:t>
+            </w:r>
+          </w:p>
+          <w:p>
+            <w:r>
+              <w:rPr>
+                <w:b/>
+                <w:color w:val="1B2A4A"/>
+                <w:sz w:val="18"/>
+              </w:rPr>
+              <w:t>BEHAVIOUR CHANGE</w:t>
+            </w:r>
+          </w:p>
+          <w:p>
+            <w:pPr>
+              <w:spacing w:before="80"/>
+            </w:pPr>
+            <w:r>
+              <w:rPr>
+                <w:i/>
+                <w:color w:val="333333"/>
+                <w:sz w:val="16"/>
+              </w:rPr>
+              <w:t>IEC, Nukkad Nataks, dark-spot transformation, community cleanup drives, Swachhata Ambassadors</w:t>
+            </w:r>
+          </w:p>
+        </w:tc>
+        <w:tc>
+          <w:tcPr>
+            <w:tcW w:type="dxa" w:w="3118"/>
+            <w:shd w:val="clear" w:color="auto" w:fill="00877A"/>
+            <w:tcBorders>
+              <w:top w:val="single" w:sz="4" w:space="0" w:color="CCCCCC"/>
+              <w:left w:val="single" w:sz="4" w:space="0" w:color="CCCCCC"/>
+              <w:bottom w:val="single" w:sz="4" w:space="0" w:color="CCCCCC"/>
+              <w:right w:val="single" w:sz="4" w:space="0" w:color="CCCCCC"/>
+            </w:tcBorders>
+            <w:tcMar>
+              <w:top w:w="120" w:type="dxa"/>
+              <w:bottom w:w="120" w:type="dxa"/>
+              <w:left w:w="140" w:type="dxa"/>
+              <w:right w:w="140" w:type="dxa"/>
+            </w:tcMar>
+          </w:tcPr>
+          <w:p>
+            <w:r>
+              <w:rPr>
+                <w:b/>
+                <w:color w:val="FFFFFF"/>
+                <w:sz w:val="56"/>
+              </w:rPr>
+              <w:t>02</w:t>
+            </w:r>
+          </w:p>
+          <w:p>
+            <w:r>
+              <w:rPr>
+                <w:b/>
+                <w:color w:val="FFFFFF"/>
+                <w:sz w:val="18"/>
+              </w:rPr>
+              <w:t>MONITORING WASTE</w:t>
+              <w:br/>
+              <w:t>COLLECTION</w:t>
+            </w:r>
+          </w:p>
+          <w:p>
+            <w:pPr>
+              <w:spacing w:before="80"/>
+            </w:pPr>
+            <w:r>
+              <w:rPr>
+                <w:i/>
+                <w:color w:val="E0F0EE"/>
+                <w:sz w:val="16"/>
+              </w:rPr>
+              <w:t>Monitoring collection across Dharamshala in close collaboration with MC</w:t>
+            </w:r>
+          </w:p>
+        </w:tc>
+        <w:tc>
+          <w:tcPr>
+            <w:tcW w:type="dxa" w:w="3118"/>
+            <w:shd w:val="clear" w:color="auto" w:fill="FDF6E3"/>
+            <w:tcBorders>
+              <w:top w:val="single" w:sz="4" w:space="0" w:color="CCCCCC"/>
+              <w:left w:val="single" w:sz="4" w:space="0" w:color="CCCCCC"/>
+              <w:bottom w:val="single" w:sz="4" w:space="0" w:color="CCCCCC"/>
+              <w:right w:val="single" w:sz="4" w:space="0" w:color="CCCCCC"/>
+            </w:tcBorders>
+            <w:tcMar>
+              <w:top w:w="120" w:type="dxa"/>
+              <w:bottom w:w="120" w:type="dxa"/>
+              <w:left w:w="140" w:type="dxa"/>
+              <w:right w:w="140" w:type="dxa"/>
+            </w:tcMar>
+          </w:tcPr>
+          <w:p>
+            <w:r>
+              <w:rPr>
+                <w:b/>
+                <w:color w:val="1B2A4A"/>
+                <w:sz w:val="56"/>
+              </w:rPr>
+              <w:t>03</w:t>
+            </w:r>
+          </w:p>
+          <w:p>
+            <w:r>
+              <w:rPr>
+                <w:b/>
+                <w:color w:val="1B2A4A"/>
+                <w:sz w:val="18"/>
+              </w:rPr>
+              <w:t>RECYCLING AT THE MRF</w:t>
+            </w:r>
+          </w:p>
+          <w:p>
+            <w:pPr>
+              <w:spacing w:before="80"/>
+            </w:pPr>
+            <w:r>
+              <w:rPr>
+                <w:i/>
+                <w:color w:val="333333"/>
+                <w:sz w:val="16"/>
+              </w:rPr>
+              <w:t>Hand-segregation across 20+ categories; wet waste to biogas; MRF expansion works</w:t>
+            </w:r>
+          </w:p>
+        </w:tc>
+      </w:tr>
+      <w:tr>
+        <w:tc>
+          <w:tcPr>
+            <w:tcW w:type="dxa" w:w="3118"/>
+            <w:shd w:val="clear" w:color="auto" w:fill="00877A"/>
+            <w:tcBorders>
+              <w:top w:val="single" w:sz="4" w:space="0" w:color="CCCCCC"/>
+              <w:left w:val="single" w:sz="4" w:space="0" w:color="CCCCCC"/>
+              <w:bottom w:val="single" w:sz="4" w:space="0" w:color="CCCCCC"/>
+              <w:right w:val="single" w:sz="4" w:space="0" w:color="CCCCCC"/>
+            </w:tcBorders>
+            <w:tcMar>
+              <w:top w:w="120" w:type="dxa"/>
+              <w:bottom w:w="120" w:type="dxa"/>
+              <w:left w:w="140" w:type="dxa"/>
+              <w:right w:w="140" w:type="dxa"/>
+            </w:tcMar>
+          </w:tcPr>
+          <w:p>
+            <w:r>
+              <w:rPr>
+                <w:b/>
+                <w:color w:val="FFFFFF"/>
+                <w:sz w:val="56"/>
+              </w:rPr>
+              <w:t>04</w:t>
+            </w:r>
+          </w:p>
+          <w:p>
+            <w:r>
+              <w:rPr>
+                <w:b/>
+                <w:color w:val="FFFFFF"/>
+                <w:sz w:val="18"/>
+              </w:rPr>
+              <w:t>WASTE TRANSPORT</w:t>
+            </w:r>
+          </w:p>
+          <w:p>
+            <w:pPr>
+              <w:spacing w:before="80"/>
+            </w:pPr>
+            <w:r>
+              <w:rPr>
+                <w:i/>
+                <w:color w:val="E0F0EE"/>
+                <w:sz w:val="16"/>
+              </w:rPr>
+              <w:t>Processed recyclables transported to authorised recyclers and downstream aggregators</w:t>
+            </w:r>
+          </w:p>
+        </w:tc>
+        <w:tc>
+          <w:tcPr>
+            <w:tcW w:type="dxa" w:w="3118"/>
+            <w:shd w:val="clear" w:color="auto" w:fill="FDF6E3"/>
+            <w:tcBorders>
+              <w:top w:val="single" w:sz="4" w:space="0" w:color="CCCCCC"/>
+              <w:left w:val="single" w:sz="4" w:space="0" w:color="CCCCCC"/>
+              <w:bottom w:val="single" w:sz="4" w:space="0" w:color="CCCCCC"/>
+              <w:right w:val="single" w:sz="4" w:space="0" w:color="CCCCCC"/>
+            </w:tcBorders>
+            <w:tcMar>
+              <w:top w:w="120" w:type="dxa"/>
+              <w:bottom w:w="120" w:type="dxa"/>
+              <w:left w:w="140" w:type="dxa"/>
+              <w:right w:w="140" w:type="dxa"/>
+            </w:tcMar>
+          </w:tcPr>
+          <w:p>
+            <w:r>
+              <w:rPr>
+                <w:b/>
+                <w:color w:val="1B2A4A"/>
+                <w:sz w:val="56"/>
+              </w:rPr>
+              <w:t>05</w:t>
+            </w:r>
+          </w:p>
+          <w:p>
+            <w:r>
+              <w:rPr>
+                <w:b/>
+                <w:color w:val="1B2A4A"/>
+                <w:sz w:val="18"/>
+              </w:rPr>
+              <w:t>GOVERNMENT</w:t>
+              <w:br/>
+              <w:t>ENGAGEMENT</w:t>
+            </w:r>
+          </w:p>
+          <w:p>
+            <w:pPr>
+              <w:spacing w:before="80"/>
+            </w:pPr>
+            <w:r>
+              <w:rPr>
+                <w:i/>
+                <w:color w:val="333333"/>
+                <w:sz w:val="16"/>
+              </w:rPr>
+              <w:t>DMC coordination; Swachh Survekshan 2026; digital dashboards and policy linkages</w:t>
+            </w:r>
+          </w:p>
+        </w:tc>
+        <w:tc>
+          <w:tcPr>
+            <w:tcW w:type="dxa" w:w="3118"/>
+            <w:shd w:val="clear" w:color="auto" w:fill="00877A"/>
+            <w:tcBorders>
+              <w:top w:val="single" w:sz="4" w:space="0" w:color="CCCCCC"/>
+              <w:left w:val="single" w:sz="4" w:space="0" w:color="CCCCCC"/>
+              <w:bottom w:val="single" w:sz="4" w:space="0" w:color="CCCCCC"/>
+              <w:right w:val="single" w:sz="4" w:space="0" w:color="CCCCCC"/>
+            </w:tcBorders>
+            <w:tcMar>
+              <w:top w:w="120" w:type="dxa"/>
+              <w:bottom w:w="120" w:type="dxa"/>
+              <w:left w:w="140" w:type="dxa"/>
+              <w:right w:w="140" w:type="dxa"/>
+            </w:tcMar>
+          </w:tcPr>
+          <w:p>
+            <w:r>
+              <w:rPr>
+                <w:b/>
+                <w:color w:val="FFFFFF"/>
+                <w:sz w:val="56"/>
+              </w:rPr>
+              <w:t>06</w:t>
+            </w:r>
+          </w:p>
+          <w:p>
+            <w:r>
+              <w:rPr>
+                <w:b/>
+                <w:color w:val="FFFFFF"/>
+                <w:sz w:val="18"/>
+              </w:rPr>
+              <w:t>LIVELIHOOD</w:t>
+              <w:br/>
+              <w:t>GENERATION</w:t>
+            </w:r>
+          </w:p>
+          <w:p>
+            <w:pPr>
+              <w:spacing w:before="80"/>
+            </w:pPr>
+            <w:r>
+              <w:rPr>
+                <w:i/>
+                <w:color w:val="E0F0EE"/>
+                <w:sz w:val="16"/>
+              </w:rPr>
+              <w:t>15 Green Workers: wages, meals, insurance, vocational training, ecopreneur development</w:t>
+            </w:r>
+          </w:p>
+        </w:tc>
+      </w:tr>
+    </w:tbl>
+    <w:p>
+      <w:pPr>
+        <w:spacing w:after="320"/>
+      </w:pPr>
+    </w:p>
+    <w:p>
+      <w:r>
+        <w:br w:type="page"/>
+      </w:r>
+    </w:p>
+    <w:p>
+      <w:pPr>
+        <w:pStyle w:val="Heading1"/>
+        <w:spacing w:before="360" w:after="120"/>
+        <w:jc w:val="both"/>
+      </w:pPr>
+      <w:r>
+        <w:rPr>
+          <w:color w:val="1B2A4A"/>
+        </w:rPr>
         <w:t>Our Activities</w:t>
       </w:r>
     </w:p>
@@ -1339,40 +1704,61 @@
           <w:color w:val="333333"/>
           <w:sz w:val="20"/>
         </w:rPr>
-        <w:t>The Closing the Loop programme is organised around six pillars of the waste value chain, each addressing a distinct stage — from the moment a household separates its waste to the moment a recycled material reaches a verified end market. Together they form a closed loop.</w:t>
+        <w:t>Each pillar is described in detail below, with specific activities, rationale, and the mechanism by which it contributes to the overall value chain. The six pillars are interdependent — this programme funds all six simultaneously.</w:t>
       </w:r>
+    </w:p>
+    <w:tbl>
+      <w:tblPr>
+        <w:tblW w:type="auto" w:w="0"/>
+        <w:jc w:val="left"/>
+        <w:tblLook w:firstColumn="1" w:firstRow="1" w:lastColumn="0" w:lastRow="0" w:noHBand="0" w:noVBand="1" w:val="04A0"/>
+      </w:tblPr>
+      <w:tblGrid>
+        <w:gridCol w:w="9360"/>
+      </w:tblGrid>
+      <w:tr>
+        <w:tc>
+          <w:tcPr>
+            <w:tcW w:type="dxa" w:w="9360"/>
+            <w:shd w:val="clear" w:color="auto" w:fill="1B2A4A"/>
+            <w:tcMar>
+              <w:top w:w="100" w:type="dxa"/>
+              <w:bottom w:w="100" w:type="dxa"/>
+              <w:left w:w="140" w:type="dxa"/>
+              <w:right w:w="140" w:type="dxa"/>
+            </w:tcMar>
+          </w:tcPr>
+          <w:p>
+            <w:r>
+              <w:rPr>
+                <w:b/>
+                <w:color w:val="FFFFFF"/>
+                <w:sz w:val="26"/>
+              </w:rPr>
+              <w:t>01  —  BEHAVIOUR CHANGE &amp; IEC</w:t>
+            </w:r>
+          </w:p>
+          <w:p>
+            <w:r>
+              <w:rPr>
+                <w:i/>
+                <w:color w:val="CCE8E6"/>
+                <w:sz w:val="18"/>
+              </w:rPr>
+              <w:t>Clean Neighbourhoods · Source Segregation · Civic Ownership · ULB Partnership</w:t>
+            </w:r>
+          </w:p>
+        </w:tc>
+      </w:tr>
+    </w:tbl>
+    <w:p>
+      <w:pPr>
+        <w:spacing w:after="120"/>
+      </w:pPr>
     </w:p>
     <w:p>
       <w:pPr>
-        <w:pStyle w:val="Heading2"/>
-        <w:spacing w:before="240" w:after="80"/>
-        <w:jc w:val="both"/>
-      </w:pPr>
-      <w:r>
-        <w:rPr>
-          <w:b/>
-          <w:sz w:val="24"/>
-        </w:rPr>
-        <w:t>Pillar 1: Clean Neighbourhoods — Behaviour Change &amp; IEC</w:t>
-      </w:r>
-    </w:p>
-    <w:p>
-      <w:pPr>
-        <w:spacing w:before="0" w:after="80"/>
-        <w:jc w:val="both"/>
-      </w:pPr>
-      <w:r>
-        <w:rPr>
-          <w:b w:val="0"/>
-          <w:color w:val="00877A"/>
-          <w:sz w:val="20"/>
-        </w:rPr>
-        <w:t>Theme: Community Education, Source Segregation &amp; Civic Ownership</w:t>
-      </w:r>
-    </w:p>
-    <w:p>
-      <w:pPr>
-        <w:spacing w:before="40" w:after="120"/>
+        <w:spacing w:before="40" w:after="160"/>
         <w:jc w:val="both"/>
       </w:pPr>
       <w:r>
@@ -1381,140 +1767,805 @@
           <w:color w:val="333333"/>
           <w:sz w:val="20"/>
         </w:rPr>
-        <w:t>No collection or processing system works without consistent source segregation at the household level. A family that mixes waste at source undoes the efficiency of every downstream investment. This pillar builds the community knowledge, peer accountability, and visual infrastructure that keeps segregation rates high across all 17 wards.</w:t>
+        <w:t>To make the city visibly cleaner and improve the Urban Local Body's (ULB, i.e. the Nagar Palika) Swachhata Survekshan Ranking, Waste Warriors proposes to mobilise multiple direct-action interventions and visual transformations with city-wide Information, Education and Communication (IEC). No collection or processing system works without consistent source segregation at the household level — this pillar builds the knowledge, peer accountability, and physical infrastructure that sustains it across all 17 wards.</w:t>
       </w:r>
     </w:p>
+    <w:tbl>
+      <w:tblPr>
+        <w:tblW w:type="auto" w:w="0"/>
+        <w:jc w:val="left"/>
+        <w:tblLook w:firstColumn="1" w:firstRow="1" w:lastColumn="0" w:lastRow="0" w:noHBand="0" w:noVBand="1" w:val="04A0"/>
+      </w:tblPr>
+      <w:tblGrid>
+        <w:gridCol w:w="3120"/>
+        <w:gridCol w:w="3120"/>
+        <w:gridCol w:w="3120"/>
+      </w:tblGrid>
+      <w:tr>
+        <w:tc>
+          <w:tcPr>
+            <w:tcW w:type="dxa" w:w="3118"/>
+            <w:shd w:val="clear" w:color="auto" w:fill="F2F7F6"/>
+            <w:tcMar>
+              <w:top w:w="90" w:type="dxa"/>
+              <w:bottom w:w="90" w:type="dxa"/>
+              <w:left w:w="110" w:type="dxa"/>
+              <w:right w:w="110" w:type="dxa"/>
+            </w:tcMar>
+          </w:tcPr>
+          <w:p>
+            <w:r>
+              <w:rPr>
+                <w:b/>
+                <w:color w:val="00877A"/>
+                <w:sz w:val="18"/>
+              </w:rPr>
+              <w:t xml:space="preserve">01  </w:t>
+            </w:r>
+            <w:r>
+              <w:rPr>
+                <w:b/>
+                <w:color w:val="1B2A4A"/>
+                <w:sz w:val="18"/>
+              </w:rPr>
+              <w:t>Regular Follow-ups with 27 Waste Collection Vehicles &amp; Workers</w:t>
+            </w:r>
+          </w:p>
+        </w:tc>
+        <w:tc>
+          <w:tcPr>
+            <w:tcW w:type="dxa" w:w="1417"/>
+            <w:shd w:val="clear" w:color="auto" w:fill="00877A"/>
+            <w:tcMar>
+              <w:top w:w="90" w:type="dxa"/>
+              <w:bottom w:w="90" w:type="dxa"/>
+              <w:left w:w="100" w:type="dxa"/>
+              <w:right w:w="100" w:type="dxa"/>
+            </w:tcMar>
+          </w:tcPr>
+          <w:p>
+            <w:pPr>
+              <w:jc w:val="center"/>
+            </w:pPr>
+            <w:r>
+              <w:rPr>
+                <w:i/>
+                <w:color w:val="FFFFFF"/>
+                <w:sz w:val="16"/>
+              </w:rPr>
+              <w:t>17 Wards</w:t>
+            </w:r>
+          </w:p>
+        </w:tc>
+        <w:tc>
+          <w:tcPr>
+            <w:tcW w:type="dxa" w:w="4932"/>
+            <w:shd w:val="clear" w:color="auto" w:fill="FFFFFF"/>
+            <w:tcMar>
+              <w:top w:w="90" w:type="dxa"/>
+              <w:bottom w:w="90" w:type="dxa"/>
+              <w:left w:w="110" w:type="dxa"/>
+              <w:right w:w="110" w:type="dxa"/>
+            </w:tcMar>
+          </w:tcPr>
+          <w:p>
+            <w:r>
+              <w:rPr>
+                <w:color w:val="333333"/>
+                <w:sz w:val="17"/>
+              </w:rPr>
+              <w:t>Daily monitoring of all 27 collection vehicles and sanitation workers across 17 wards — verifying route coverage, segregation compliance at point of collection, and worker accountability.</w:t>
+            </w:r>
+          </w:p>
+        </w:tc>
+      </w:tr>
+      <w:tr>
+        <w:tc>
+          <w:tcPr>
+            <w:tcW w:type="dxa" w:w="3118"/>
+            <w:shd w:val="clear" w:color="auto" w:fill="E8F4F2"/>
+            <w:tcMar>
+              <w:top w:w="90" w:type="dxa"/>
+              <w:bottom w:w="90" w:type="dxa"/>
+              <w:left w:w="110" w:type="dxa"/>
+              <w:right w:w="110" w:type="dxa"/>
+            </w:tcMar>
+          </w:tcPr>
+          <w:p>
+            <w:r>
+              <w:rPr>
+                <w:b/>
+                <w:color w:val="00877A"/>
+                <w:sz w:val="18"/>
+              </w:rPr>
+              <w:t xml:space="preserve">02  </w:t>
+            </w:r>
+            <w:r>
+              <w:rPr>
+                <w:b/>
+                <w:color w:val="1B2A4A"/>
+                <w:sz w:val="18"/>
+              </w:rPr>
+              <w:t>Monthly Knowledge Transfer to the ULB</w:t>
+            </w:r>
+          </w:p>
+        </w:tc>
+        <w:tc>
+          <w:tcPr>
+            <w:tcW w:type="dxa" w:w="1417"/>
+            <w:shd w:val="clear" w:color="auto" w:fill="1B2A4A"/>
+            <w:tcMar>
+              <w:top w:w="90" w:type="dxa"/>
+              <w:bottom w:w="90" w:type="dxa"/>
+              <w:left w:w="100" w:type="dxa"/>
+              <w:right w:w="100" w:type="dxa"/>
+            </w:tcMar>
+          </w:tcPr>
+          <w:p>
+            <w:pPr>
+              <w:jc w:val="center"/>
+            </w:pPr>
+            <w:r>
+              <w:rPr>
+                <w:i/>
+                <w:color w:val="FFFFFF"/>
+                <w:sz w:val="16"/>
+              </w:rPr>
+              <w:t>Monthly · ULB</w:t>
+            </w:r>
+          </w:p>
+        </w:tc>
+        <w:tc>
+          <w:tcPr>
+            <w:tcW w:type="dxa" w:w="4932"/>
+            <w:shd w:val="clear" w:color="auto" w:fill="FFFFFF"/>
+            <w:tcMar>
+              <w:top w:w="90" w:type="dxa"/>
+              <w:bottom w:w="90" w:type="dxa"/>
+              <w:left w:w="110" w:type="dxa"/>
+              <w:right w:w="110" w:type="dxa"/>
+            </w:tcMar>
+          </w:tcPr>
+          <w:p>
+            <w:r>
+              <w:rPr>
+                <w:color w:val="333333"/>
+                <w:sz w:val="17"/>
+              </w:rPr>
+              <w:t>The team will share progress made and transfer knowledge on IEC, BCC and monitoring activities with the Urban Local Body every month — easing the responsibility handover process and building institutional capacity within the Nagar Palika.</w:t>
+            </w:r>
+          </w:p>
+        </w:tc>
+      </w:tr>
+      <w:tr>
+        <w:tc>
+          <w:tcPr>
+            <w:tcW w:type="dxa" w:w="3118"/>
+            <w:shd w:val="clear" w:color="auto" w:fill="F2F7F6"/>
+            <w:tcMar>
+              <w:top w:w="90" w:type="dxa"/>
+              <w:bottom w:w="90" w:type="dxa"/>
+              <w:left w:w="110" w:type="dxa"/>
+              <w:right w:w="110" w:type="dxa"/>
+            </w:tcMar>
+          </w:tcPr>
+          <w:p>
+            <w:r>
+              <w:rPr>
+                <w:b/>
+                <w:color w:val="00877A"/>
+                <w:sz w:val="18"/>
+              </w:rPr>
+              <w:t xml:space="preserve">03  </w:t>
+            </w:r>
+            <w:r>
+              <w:rPr>
+                <w:b/>
+                <w:color w:val="1B2A4A"/>
+                <w:sz w:val="18"/>
+              </w:rPr>
+              <w:t>Citizen Feedback Mechanism</w:t>
+            </w:r>
+          </w:p>
+        </w:tc>
+        <w:tc>
+          <w:tcPr>
+            <w:tcW w:type="dxa" w:w="1417"/>
+            <w:shd w:val="clear" w:color="auto" w:fill="00877A"/>
+            <w:tcMar>
+              <w:top w:w="90" w:type="dxa"/>
+              <w:bottom w:w="90" w:type="dxa"/>
+              <w:left w:w="100" w:type="dxa"/>
+              <w:right w:w="100" w:type="dxa"/>
+            </w:tcMar>
+          </w:tcPr>
+          <w:p>
+            <w:pPr>
+              <w:jc w:val="center"/>
+            </w:pPr>
+            <w:r>
+              <w:rPr>
+                <w:i/>
+                <w:color w:val="FFFFFF"/>
+                <w:sz w:val="16"/>
+              </w:rPr>
+              <w:t>City-wide</w:t>
+            </w:r>
+          </w:p>
+        </w:tc>
+        <w:tc>
+          <w:tcPr>
+            <w:tcW w:type="dxa" w:w="4932"/>
+            <w:shd w:val="clear" w:color="auto" w:fill="FFFFFF"/>
+            <w:tcMar>
+              <w:top w:w="90" w:type="dxa"/>
+              <w:bottom w:w="90" w:type="dxa"/>
+              <w:left w:w="110" w:type="dxa"/>
+              <w:right w:w="110" w:type="dxa"/>
+            </w:tcMar>
+          </w:tcPr>
+          <w:p>
+            <w:r>
+              <w:rPr>
+                <w:color w:val="333333"/>
+                <w:sz w:val="17"/>
+              </w:rPr>
+              <w:t>Ideate and identify an easy-to-use mechanism for citizens to give feedback on Swachhata activities directly with the ULB — creating an accessible, democratic accountability loop.</w:t>
+            </w:r>
+          </w:p>
+        </w:tc>
+      </w:tr>
+      <w:tr>
+        <w:tc>
+          <w:tcPr>
+            <w:tcW w:type="dxa" w:w="3118"/>
+            <w:shd w:val="clear" w:color="auto" w:fill="E8F4F2"/>
+            <w:tcMar>
+              <w:top w:w="90" w:type="dxa"/>
+              <w:bottom w:w="90" w:type="dxa"/>
+              <w:left w:w="110" w:type="dxa"/>
+              <w:right w:w="110" w:type="dxa"/>
+            </w:tcMar>
+          </w:tcPr>
+          <w:p>
+            <w:r>
+              <w:rPr>
+                <w:b/>
+                <w:color w:val="00877A"/>
+                <w:sz w:val="18"/>
+              </w:rPr>
+              <w:t xml:space="preserve">04  </w:t>
+            </w:r>
+            <w:r>
+              <w:rPr>
+                <w:b/>
+                <w:color w:val="1B2A4A"/>
+                <w:sz w:val="18"/>
+              </w:rPr>
+              <w:t>Felicitation of Swachhata Champions</w:t>
+            </w:r>
+          </w:p>
+        </w:tc>
+        <w:tc>
+          <w:tcPr>
+            <w:tcW w:type="dxa" w:w="1417"/>
+            <w:shd w:val="clear" w:color="auto" w:fill="1B2A4A"/>
+            <w:tcMar>
+              <w:top w:w="90" w:type="dxa"/>
+              <w:bottom w:w="90" w:type="dxa"/>
+              <w:left w:w="100" w:type="dxa"/>
+              <w:right w:w="100" w:type="dxa"/>
+            </w:tcMar>
+          </w:tcPr>
+          <w:p>
+            <w:pPr>
+              <w:jc w:val="center"/>
+            </w:pPr>
+            <w:r>
+              <w:rPr>
+                <w:i/>
+                <w:color w:val="FFFFFF"/>
+                <w:sz w:val="16"/>
+              </w:rPr>
+              <w:t>Community-wide</w:t>
+            </w:r>
+          </w:p>
+        </w:tc>
+        <w:tc>
+          <w:tcPr>
+            <w:tcW w:type="dxa" w:w="4932"/>
+            <w:shd w:val="clear" w:color="auto" w:fill="FFFFFF"/>
+            <w:tcMar>
+              <w:top w:w="90" w:type="dxa"/>
+              <w:bottom w:w="90" w:type="dxa"/>
+              <w:left w:w="110" w:type="dxa"/>
+              <w:right w:w="110" w:type="dxa"/>
+            </w:tcMar>
+          </w:tcPr>
+          <w:p>
+            <w:r>
+              <w:rPr>
+                <w:color w:val="333333"/>
+                <w:sz w:val="17"/>
+              </w:rPr>
+              <w:t>Felicitate and celebrate active citizens (Swachhata Champions), influencers and changemakers of Swachhata initiatives in the project area — building peer recognition and positive social norms around cleanliness.</w:t>
+            </w:r>
+          </w:p>
+        </w:tc>
+      </w:tr>
+      <w:tr>
+        <w:tc>
+          <w:tcPr>
+            <w:tcW w:type="dxa" w:w="3118"/>
+            <w:shd w:val="clear" w:color="auto" w:fill="F2F7F6"/>
+            <w:tcMar>
+              <w:top w:w="90" w:type="dxa"/>
+              <w:bottom w:w="90" w:type="dxa"/>
+              <w:left w:w="110" w:type="dxa"/>
+              <w:right w:w="110" w:type="dxa"/>
+            </w:tcMar>
+          </w:tcPr>
+          <w:p>
+            <w:r>
+              <w:rPr>
+                <w:b/>
+                <w:color w:val="00877A"/>
+                <w:sz w:val="18"/>
+              </w:rPr>
+              <w:t xml:space="preserve">05  </w:t>
+            </w:r>
+            <w:r>
+              <w:rPr>
+                <w:b/>
+                <w:color w:val="1B2A4A"/>
+                <w:sz w:val="18"/>
+              </w:rPr>
+              <w:t>Signboards, Wall Murals &amp; Art Installations</w:t>
+            </w:r>
+          </w:p>
+        </w:tc>
+        <w:tc>
+          <w:tcPr>
+            <w:tcW w:type="dxa" w:w="1417"/>
+            <w:shd w:val="clear" w:color="auto" w:fill="00877A"/>
+            <w:tcMar>
+              <w:top w:w="90" w:type="dxa"/>
+              <w:bottom w:w="90" w:type="dxa"/>
+              <w:left w:w="100" w:type="dxa"/>
+              <w:right w:w="100" w:type="dxa"/>
+            </w:tcMar>
+          </w:tcPr>
+          <w:p>
+            <w:pPr>
+              <w:jc w:val="center"/>
+            </w:pPr>
+            <w:r>
+              <w:rPr>
+                <w:i/>
+                <w:color w:val="FFFFFF"/>
+                <w:sz w:val="16"/>
+              </w:rPr>
+              <w:t>17 Wards</w:t>
+            </w:r>
+          </w:p>
+        </w:tc>
+        <w:tc>
+          <w:tcPr>
+            <w:tcW w:type="dxa" w:w="4932"/>
+            <w:shd w:val="clear" w:color="auto" w:fill="FFFFFF"/>
+            <w:tcMar>
+              <w:top w:w="90" w:type="dxa"/>
+              <w:bottom w:w="90" w:type="dxa"/>
+              <w:left w:w="110" w:type="dxa"/>
+              <w:right w:w="110" w:type="dxa"/>
+            </w:tcMar>
+          </w:tcPr>
+          <w:p>
+            <w:r>
+              <w:rPr>
+                <w:color w:val="333333"/>
+                <w:sz w:val="17"/>
+              </w:rPr>
+              <w:t>Signboards, wall murals and art installations with civic messaging — designed and submitted to the ULB for formal approval before installation. Every high-footfall point becomes a permanent visual reminder of responsible waste management.</w:t>
+            </w:r>
+          </w:p>
+        </w:tc>
+      </w:tr>
+      <w:tr>
+        <w:tc>
+          <w:tcPr>
+            <w:tcW w:type="dxa" w:w="3118"/>
+            <w:shd w:val="clear" w:color="auto" w:fill="E8F4F2"/>
+            <w:tcMar>
+              <w:top w:w="90" w:type="dxa"/>
+              <w:bottom w:w="90" w:type="dxa"/>
+              <w:left w:w="110" w:type="dxa"/>
+              <w:right w:w="110" w:type="dxa"/>
+            </w:tcMar>
+          </w:tcPr>
+          <w:p>
+            <w:r>
+              <w:rPr>
+                <w:b/>
+                <w:color w:val="00877A"/>
+                <w:sz w:val="18"/>
+              </w:rPr>
+              <w:t xml:space="preserve">06  </w:t>
+            </w:r>
+            <w:r>
+              <w:rPr>
+                <w:b/>
+                <w:color w:val="1B2A4A"/>
+                <w:sz w:val="18"/>
+              </w:rPr>
+              <w:t>Two Zero Waste Melas</w:t>
+            </w:r>
+          </w:p>
+        </w:tc>
+        <w:tc>
+          <w:tcPr>
+            <w:tcW w:type="dxa" w:w="1417"/>
+            <w:shd w:val="clear" w:color="auto" w:fill="1B2A4A"/>
+            <w:tcMar>
+              <w:top w:w="90" w:type="dxa"/>
+              <w:bottom w:w="90" w:type="dxa"/>
+              <w:left w:w="100" w:type="dxa"/>
+              <w:right w:w="100" w:type="dxa"/>
+            </w:tcMar>
+          </w:tcPr>
+          <w:p>
+            <w:pPr>
+              <w:jc w:val="center"/>
+            </w:pPr>
+            <w:r>
+              <w:rPr>
+                <w:i/>
+                <w:color w:val="FFFFFF"/>
+                <w:sz w:val="16"/>
+              </w:rPr>
+              <w:t>2 Events · Year</w:t>
+            </w:r>
+          </w:p>
+        </w:tc>
+        <w:tc>
+          <w:tcPr>
+            <w:tcW w:type="dxa" w:w="4932"/>
+            <w:shd w:val="clear" w:color="auto" w:fill="FFFFFF"/>
+            <w:tcMar>
+              <w:top w:w="90" w:type="dxa"/>
+              <w:bottom w:w="90" w:type="dxa"/>
+              <w:left w:w="110" w:type="dxa"/>
+              <w:right w:w="110" w:type="dxa"/>
+            </w:tcMar>
+          </w:tcPr>
+          <w:p>
+            <w:r>
+              <w:rPr>
+                <w:color w:val="333333"/>
+                <w:sz w:val="17"/>
+              </w:rPr>
+              <w:t>Organise two Zero Waste Melas with the support of the Dharamshala Municipal Corporation — combining waste awareness programming, community celebration, and felicitation of changemakers.</w:t>
+            </w:r>
+          </w:p>
+        </w:tc>
+      </w:tr>
+      <w:tr>
+        <w:tc>
+          <w:tcPr>
+            <w:tcW w:type="dxa" w:w="3118"/>
+            <w:shd w:val="clear" w:color="auto" w:fill="F2F7F6"/>
+            <w:tcMar>
+              <w:top w:w="90" w:type="dxa"/>
+              <w:bottom w:w="90" w:type="dxa"/>
+              <w:left w:w="110" w:type="dxa"/>
+              <w:right w:w="110" w:type="dxa"/>
+            </w:tcMar>
+          </w:tcPr>
+          <w:p>
+            <w:r>
+              <w:rPr>
+                <w:b/>
+                <w:color w:val="00877A"/>
+                <w:sz w:val="18"/>
+              </w:rPr>
+              <w:t xml:space="preserve">07  </w:t>
+            </w:r>
+            <w:r>
+              <w:rPr>
+                <w:b/>
+                <w:color w:val="1B2A4A"/>
+                <w:sz w:val="18"/>
+              </w:rPr>
+              <w:t>Monthly Cleanup Drive in Each Ward</w:t>
+            </w:r>
+          </w:p>
+        </w:tc>
+        <w:tc>
+          <w:tcPr>
+            <w:tcW w:type="dxa" w:w="1417"/>
+            <w:shd w:val="clear" w:color="auto" w:fill="00877A"/>
+            <w:tcMar>
+              <w:top w:w="90" w:type="dxa"/>
+              <w:bottom w:w="90" w:type="dxa"/>
+              <w:left w:w="100" w:type="dxa"/>
+              <w:right w:w="100" w:type="dxa"/>
+            </w:tcMar>
+          </w:tcPr>
+          <w:p>
+            <w:pPr>
+              <w:jc w:val="center"/>
+            </w:pPr>
+            <w:r>
+              <w:rPr>
+                <w:i/>
+                <w:color w:val="FFFFFF"/>
+                <w:sz w:val="16"/>
+              </w:rPr>
+              <w:t>17 Wards × 12 Months</w:t>
+            </w:r>
+          </w:p>
+        </w:tc>
+        <w:tc>
+          <w:tcPr>
+            <w:tcW w:type="dxa" w:w="4932"/>
+            <w:shd w:val="clear" w:color="auto" w:fill="FFFFFF"/>
+            <w:tcMar>
+              <w:top w:w="90" w:type="dxa"/>
+              <w:bottom w:w="90" w:type="dxa"/>
+              <w:left w:w="110" w:type="dxa"/>
+              <w:right w:w="110" w:type="dxa"/>
+            </w:tcMar>
+          </w:tcPr>
+          <w:p>
+            <w:r>
+              <w:rPr>
+                <w:color w:val="333333"/>
+                <w:sz w:val="17"/>
+              </w:rPr>
+              <w:t>Organise a monthly cleanup drive in each ward — removing accumulated waste from public spaces and creating a civic platform for youth and women to step forward as environmental actors.</w:t>
+            </w:r>
+          </w:p>
+        </w:tc>
+      </w:tr>
+      <w:tr>
+        <w:tc>
+          <w:tcPr>
+            <w:tcW w:type="dxa" w:w="3118"/>
+            <w:shd w:val="clear" w:color="auto" w:fill="E8F4F2"/>
+            <w:tcMar>
+              <w:top w:w="90" w:type="dxa"/>
+              <w:bottom w:w="90" w:type="dxa"/>
+              <w:left w:w="110" w:type="dxa"/>
+              <w:right w:w="110" w:type="dxa"/>
+            </w:tcMar>
+          </w:tcPr>
+          <w:p>
+            <w:r>
+              <w:rPr>
+                <w:b/>
+                <w:color w:val="00877A"/>
+                <w:sz w:val="18"/>
+              </w:rPr>
+              <w:t xml:space="preserve">08  </w:t>
+            </w:r>
+            <w:r>
+              <w:rPr>
+                <w:b/>
+                <w:color w:val="1B2A4A"/>
+                <w:sz w:val="18"/>
+              </w:rPr>
+              <w:t>Dark Spot Documentation &amp; Reporting</w:t>
+            </w:r>
+          </w:p>
+        </w:tc>
+        <w:tc>
+          <w:tcPr>
+            <w:tcW w:type="dxa" w:w="1417"/>
+            <w:shd w:val="clear" w:color="auto" w:fill="1B2A4A"/>
+            <w:tcMar>
+              <w:top w:w="90" w:type="dxa"/>
+              <w:bottom w:w="90" w:type="dxa"/>
+              <w:left w:w="100" w:type="dxa"/>
+              <w:right w:w="100" w:type="dxa"/>
+            </w:tcMar>
+          </w:tcPr>
+          <w:p>
+            <w:pPr>
+              <w:jc w:val="center"/>
+            </w:pPr>
+            <w:r>
+              <w:rPr>
+                <w:i/>
+                <w:color w:val="FFFFFF"/>
+                <w:sz w:val="16"/>
+              </w:rPr>
+              <w:t>17 Dark Spots</w:t>
+            </w:r>
+          </w:p>
+        </w:tc>
+        <w:tc>
+          <w:tcPr>
+            <w:tcW w:type="dxa" w:w="4932"/>
+            <w:shd w:val="clear" w:color="auto" w:fill="FFFFFF"/>
+            <w:tcMar>
+              <w:top w:w="90" w:type="dxa"/>
+              <w:bottom w:w="90" w:type="dxa"/>
+              <w:left w:w="110" w:type="dxa"/>
+              <w:right w:w="110" w:type="dxa"/>
+            </w:tcMar>
+          </w:tcPr>
+          <w:p>
+            <w:r>
+              <w:rPr>
+                <w:color w:val="333333"/>
+                <w:sz w:val="17"/>
+              </w:rPr>
+              <w:t>Identify and digitally document dumping dark spots in every ward, and formally report them to the Dharamshala Municipal Corporation — creating an official, actionable record of the city's waste geography.</w:t>
+            </w:r>
+          </w:p>
+        </w:tc>
+      </w:tr>
+      <w:tr>
+        <w:tc>
+          <w:tcPr>
+            <w:tcW w:type="dxa" w:w="3118"/>
+            <w:shd w:val="clear" w:color="auto" w:fill="F2F7F6"/>
+            <w:tcMar>
+              <w:top w:w="90" w:type="dxa"/>
+              <w:bottom w:w="90" w:type="dxa"/>
+              <w:left w:w="110" w:type="dxa"/>
+              <w:right w:w="110" w:type="dxa"/>
+            </w:tcMar>
+          </w:tcPr>
+          <w:p>
+            <w:r>
+              <w:rPr>
+                <w:b/>
+                <w:color w:val="00877A"/>
+                <w:sz w:val="18"/>
+              </w:rPr>
+              <w:t xml:space="preserve">09  </w:t>
+            </w:r>
+            <w:r>
+              <w:rPr>
+                <w:b/>
+                <w:color w:val="1B2A4A"/>
+                <w:sz w:val="18"/>
+              </w:rPr>
+              <w:t>Transformation of 17 Dark Spots</w:t>
+            </w:r>
+          </w:p>
+        </w:tc>
+        <w:tc>
+          <w:tcPr>
+            <w:tcW w:type="dxa" w:w="1417"/>
+            <w:shd w:val="clear" w:color="auto" w:fill="00877A"/>
+            <w:tcMar>
+              <w:top w:w="90" w:type="dxa"/>
+              <w:bottom w:w="90" w:type="dxa"/>
+              <w:left w:w="100" w:type="dxa"/>
+              <w:right w:w="100" w:type="dxa"/>
+            </w:tcMar>
+          </w:tcPr>
+          <w:p>
+            <w:pPr>
+              <w:jc w:val="center"/>
+            </w:pPr>
+            <w:r>
+              <w:rPr>
+                <w:i/>
+                <w:color w:val="FFFFFF"/>
+                <w:sz w:val="16"/>
+              </w:rPr>
+              <w:t>1 Per Ward</w:t>
+            </w:r>
+          </w:p>
+        </w:tc>
+        <w:tc>
+          <w:tcPr>
+            <w:tcW w:type="dxa" w:w="4932"/>
+            <w:shd w:val="clear" w:color="auto" w:fill="FFFFFF"/>
+            <w:tcMar>
+              <w:top w:w="90" w:type="dxa"/>
+              <w:bottom w:w="90" w:type="dxa"/>
+              <w:left w:w="110" w:type="dxa"/>
+              <w:right w:w="110" w:type="dxa"/>
+            </w:tcMar>
+          </w:tcPr>
+          <w:p>
+            <w:r>
+              <w:rPr>
+                <w:color w:val="333333"/>
+                <w:sz w:val="17"/>
+              </w:rPr>
+              <w:t>One dark spot per ward is physically cleared, cleaned, and converted into a mural-marked public space — removing the physical norm of dumping removes the social norm of dumping.</w:t>
+            </w:r>
+          </w:p>
+        </w:tc>
+      </w:tr>
+      <w:tr>
+        <w:tc>
+          <w:tcPr>
+            <w:tcW w:type="dxa" w:w="3118"/>
+            <w:shd w:val="clear" w:color="auto" w:fill="E8F4F2"/>
+            <w:tcMar>
+              <w:top w:w="90" w:type="dxa"/>
+              <w:bottom w:w="90" w:type="dxa"/>
+              <w:left w:w="110" w:type="dxa"/>
+              <w:right w:w="110" w:type="dxa"/>
+            </w:tcMar>
+          </w:tcPr>
+          <w:p>
+            <w:r>
+              <w:rPr>
+                <w:b/>
+                <w:color w:val="00877A"/>
+                <w:sz w:val="18"/>
+              </w:rPr>
+              <w:t xml:space="preserve">10  </w:t>
+            </w:r>
+            <w:r>
+              <w:rPr>
+                <w:b/>
+                <w:color w:val="1B2A4A"/>
+                <w:sz w:val="18"/>
+              </w:rPr>
+              <w:t>Human Resource Deployment</w:t>
+            </w:r>
+          </w:p>
+        </w:tc>
+        <w:tc>
+          <w:tcPr>
+            <w:tcW w:type="dxa" w:w="1417"/>
+            <w:shd w:val="clear" w:color="auto" w:fill="1B2A4A"/>
+            <w:tcMar>
+              <w:top w:w="90" w:type="dxa"/>
+              <w:bottom w:w="90" w:type="dxa"/>
+              <w:left w:w="100" w:type="dxa"/>
+              <w:right w:w="100" w:type="dxa"/>
+            </w:tcMar>
+          </w:tcPr>
+          <w:p>
+            <w:pPr>
+              <w:jc w:val="center"/>
+            </w:pPr>
+            <w:r>
+              <w:rPr>
+                <w:i/>
+                <w:color w:val="FFFFFF"/>
+                <w:sz w:val="16"/>
+              </w:rPr>
+              <w:t>Full Programme</w:t>
+            </w:r>
+          </w:p>
+        </w:tc>
+        <w:tc>
+          <w:tcPr>
+            <w:tcW w:type="dxa" w:w="4932"/>
+            <w:shd w:val="clear" w:color="auto" w:fill="FFFFFF"/>
+            <w:tcMar>
+              <w:top w:w="90" w:type="dxa"/>
+              <w:bottom w:w="90" w:type="dxa"/>
+              <w:left w:w="110" w:type="dxa"/>
+              <w:right w:w="110" w:type="dxa"/>
+            </w:tcMar>
+          </w:tcPr>
+          <w:p>
+            <w:r>
+              <w:rPr>
+                <w:color w:val="333333"/>
+                <w:sz w:val="17"/>
+              </w:rPr>
+              <w:t>Deploy the required Human Resources for the smooth running of the model — community mobilisers, field executives, and Swachhata Coordinators operating at ward level throughout the 12-month programme.</w:t>
+            </w:r>
+          </w:p>
+        </w:tc>
+      </w:tr>
+    </w:tbl>
     <w:p>
       <w:pPr>
-        <w:spacing w:before="40" w:after="100"/>
-        <w:jc w:val="both"/>
+        <w:spacing w:after="240"/>
       </w:pPr>
-      <w:r>
-        <w:rPr>
-          <w:b/>
-          <w:color w:val="1B2A4A"/>
-          <w:sz w:val="20"/>
-        </w:rPr>
-        <w:t xml:space="preserve">Chai pe Charcha: </w:t>
-      </w:r>
-      <w:r>
-        <w:rPr>
-          <w:b w:val="0"/>
-          <w:color w:val="333333"/>
-          <w:sz w:val="20"/>
-        </w:rPr>
-        <w:t>Waste Warriors' signature community dialogue programme brings residents together monthly in each ward to discuss waste, segregation, and the shared cost of mismanagement. These are not lectures. They are neighbourhood conversations — the kind that produce the peer accountability that outlasts any campaign.</w:t>
-      </w:r>
-    </w:p>
-    <w:p>
-      <w:pPr>
-        <w:spacing w:before="40" w:after="100"/>
-        <w:jc w:val="both"/>
-      </w:pPr>
-      <w:r>
-        <w:rPr>
-          <w:b/>
-          <w:color w:val="1B2A4A"/>
-          <w:sz w:val="20"/>
-        </w:rPr>
-        <w:t xml:space="preserve">Cleanup Drives: </w:t>
-      </w:r>
-      <w:r>
-        <w:rPr>
-          <w:b w:val="0"/>
-          <w:color w:val="333333"/>
-          <w:sz w:val="20"/>
-        </w:rPr>
-        <w:t>Monthly ward-level cleanup drives serve a dual purpose: they remove accumulated waste from public spaces and create a platform for youth and women to step forward as civic actors. Every cleanup is a community conversation about why waste should not be there in the first place.</w:t>
-      </w:r>
-    </w:p>
-    <w:p>
-      <w:pPr>
-        <w:spacing w:before="40" w:after="100"/>
-        <w:jc w:val="both"/>
-      </w:pPr>
-      <w:r>
-        <w:rPr>
-          <w:b/>
-          <w:color w:val="1B2A4A"/>
-          <w:sz w:val="20"/>
-        </w:rPr>
-        <w:t xml:space="preserve">Dark Spot Transformation: </w:t>
-      </w:r>
-      <w:r>
-        <w:rPr>
-          <w:b w:val="0"/>
-          <w:color w:val="333333"/>
-          <w:sz w:val="20"/>
-        </w:rPr>
-        <w:t>17 dumping dark spots — one per ward — are identified, cleared, and converted into clean, mural-marked public spaces. Removing the physical norm of dumping removes the social norm of dumping.</w:t>
-      </w:r>
-    </w:p>
-    <w:p>
-      <w:pPr>
-        <w:spacing w:before="40" w:after="100"/>
-        <w:jc w:val="both"/>
-      </w:pPr>
-      <w:r>
-        <w:rPr>
-          <w:b/>
-          <w:color w:val="1B2A4A"/>
-          <w:sz w:val="20"/>
-        </w:rPr>
-        <w:t xml:space="preserve">Visual Communication: </w:t>
-      </w:r>
-      <w:r>
-        <w:rPr>
-          <w:b w:val="0"/>
-          <w:color w:val="333333"/>
-          <w:sz w:val="20"/>
-        </w:rPr>
-        <w:t>17 wall murals and 17 ward-level signboards with civic messaging at high-footfall points create a permanent visual grammar of accountability. The message of responsible waste management is visible even when the team is not present.</w:t>
-      </w:r>
-    </w:p>
-    <w:p>
-      <w:pPr>
-        <w:spacing w:before="40" w:after="100"/>
-        <w:jc w:val="both"/>
-      </w:pPr>
-      <w:r>
-        <w:rPr>
-          <w:b/>
-          <w:color w:val="1B2A4A"/>
-          <w:sz w:val="20"/>
-        </w:rPr>
-        <w:t xml:space="preserve">Zero Waste Melas: </w:t>
-      </w:r>
-      <w:r>
-        <w:rPr>
-          <w:b w:val="0"/>
-          <w:color w:val="333333"/>
-          <w:sz w:val="20"/>
-        </w:rPr>
-        <w:t>Two city-wide events combining waste awareness programming with community celebration, felicitation of Swachhata Champions, and institutional engagement.</w:t>
-      </w:r>
-    </w:p>
-    <w:p>
-      <w:pPr>
-        <w:spacing w:before="40" w:after="100"/>
-        <w:jc w:val="both"/>
-      </w:pPr>
-      <w:r>
-        <w:rPr>
-          <w:b/>
-          <w:color w:val="1B2A4A"/>
-          <w:sz w:val="20"/>
-        </w:rPr>
-        <w:t xml:space="preserve">Plastic Lao, Rashan Pao: </w:t>
-      </w:r>
-      <w:r>
-        <w:rPr>
-          <w:b w:val="0"/>
-          <w:color w:val="333333"/>
-          <w:sz w:val="20"/>
-        </w:rPr>
-        <w:t>An incentivised programme for informal waste pickers — low-value plastic brought to collection points is exchanged for essential commodities. It addresses two problems simultaneously: diverting a difficult waste stream, and providing direct economic support to the city's most economically precarious workers.</w:t>
-      </w:r>
     </w:p>
     <w:p>
       <w:pPr>

</xml_diff>